<commit_message>
update docx based on code change
</commit_message>
<xml_diff>
--- a/Theory-based questions-Ans_Docs/AdPlay_Written_Test_Answers.docx
+++ b/Theory-based questions-Ans_Docs/AdPlay_Written_Test_Answers.docx
@@ -922,29 +922,7 @@
         <w:spacing w:after="85"/>
       </w:pPr>
       <w:r>
-        <w:t xml:space="preserve">Require an </w:t>
-      </w:r>
-      <w:r>
-        <w:rPr>
-          <w:rFonts w:ascii="Consolas" w:hAnsi="Consolas" w:cs="Consolas"/>
-          <w:color w:val="263238"/>
-          <w:shd w:val="clear" w:color="auto" w:fill="EEF2F6"/>
-        </w:rPr>
-        <w:t>Idempotency-Key</w:t>
-      </w:r>
-      <w:r>
-        <w:t xml:space="preserve"> and store it under a unique index scoped to the authenticated user. Store a hash of the request fields that determine the charge; if the same key arrives with different fields, return </w:t>
-      </w:r>
-      <w:r>
-        <w:rPr>
-          <w:rFonts w:ascii="Consolas" w:hAnsi="Consolas" w:cs="Consolas"/>
-          <w:color w:val="263238"/>
-          <w:shd w:val="clear" w:color="auto" w:fill="EEF2F6"/>
-        </w:rPr>
-        <w:t>422</w:t>
-      </w:r>
-      <w:r>
-        <w:t>. A retry with the same key returns the saved result rather than charging again. Obtain amount and currency from the user's order, never trust a client-supplied price. Prevent a second active payment for an order with a database unique constraint.</w:t>
+        <w:t>Require an Idempotency-Key and store it under a unique index scoped to the authenticated user. Store a hash of the request fields that determine the charge; if the same key arrives with different fields, return 422. A retry with the same key returns the saved result rather than charging again: 201 for success, 402 for decline, and 202 for an unknown outcome. If the original request is still Pending or Processing, return 409 with Retry-After. Obtain amount and currency from the user's order, never trust a client-supplied price. Prevent a second active payment for an order with a database unique constraint.</w:t>
       </w:r>
     </w:p>
     <w:p>
@@ -1037,73 +1015,7 @@
         <w:spacing w:after="85"/>
       </w:pPr>
       <w:r>
-        <w:t xml:space="preserve">Verify a webhook signature against the exact raw body and a recent timestamp. In one database transaction, insert the provider event ID and update the payment. A unique event ID makes duplicate deliveries harmless. A distributed lock can reduce duplicate work, but it can expire; database constraints remain the final protection. Typical responses are </w:t>
-      </w:r>
-      <w:r>
-        <w:rPr>
-          <w:rFonts w:ascii="Consolas" w:hAnsi="Consolas" w:cs="Consolas"/>
-          <w:color w:val="263238"/>
-          <w:shd w:val="clear" w:color="auto" w:fill="EEF2F6"/>
-        </w:rPr>
-        <w:t>201</w:t>
-      </w:r>
-      <w:r>
-        <w:t xml:space="preserve"> for a completed new payment, </w:t>
-      </w:r>
-      <w:r>
-        <w:rPr>
-          <w:rFonts w:ascii="Consolas" w:hAnsi="Consolas" w:cs="Consolas"/>
-          <w:color w:val="263238"/>
-          <w:shd w:val="clear" w:color="auto" w:fill="EEF2F6"/>
-        </w:rPr>
-        <w:t>202</w:t>
-      </w:r>
-      <w:r>
-        <w:t xml:space="preserve"> while its outcome is pending/unknown, </w:t>
-      </w:r>
-      <w:r>
-        <w:rPr>
-          <w:rFonts w:ascii="Consolas" w:hAnsi="Consolas" w:cs="Consolas"/>
-          <w:color w:val="263238"/>
-          <w:shd w:val="clear" w:color="auto" w:fill="EEF2F6"/>
-        </w:rPr>
-        <w:t>409</w:t>
-      </w:r>
-      <w:r>
-        <w:t xml:space="preserve"> for a conflicting active payment, </w:t>
-      </w:r>
-      <w:r>
-        <w:rPr>
-          <w:rFonts w:ascii="Consolas" w:hAnsi="Consolas" w:cs="Consolas"/>
-          <w:color w:val="263238"/>
-          <w:shd w:val="clear" w:color="auto" w:fill="EEF2F6"/>
-        </w:rPr>
-        <w:t>422</w:t>
-      </w:r>
-      <w:r>
-        <w:t xml:space="preserve"> for key reuse with different input, and </w:t>
-      </w:r>
-      <w:r>
-        <w:rPr>
-          <w:rFonts w:ascii="Consolas" w:hAnsi="Consolas" w:cs="Consolas"/>
-          <w:color w:val="263238"/>
-          <w:shd w:val="clear" w:color="auto" w:fill="EEF2F6"/>
-        </w:rPr>
-        <w:t>402</w:t>
-      </w:r>
-      <w:r>
-        <w:t xml:space="preserve"> for a declined payment. Return safe </w:t>
-      </w:r>
-      <w:r>
-        <w:rPr>
-          <w:rFonts w:ascii="Consolas" w:hAnsi="Consolas" w:cs="Consolas"/>
-          <w:color w:val="263238"/>
-          <w:shd w:val="clear" w:color="auto" w:fill="EEF2F6"/>
-        </w:rPr>
-        <w:t>ProblemDetails</w:t>
-      </w:r>
-      <w:r>
-        <w:t xml:space="preserve"> errors.</w:t>
+        <w:t>Verify a webhook signature against the exact raw body and a recent timestamp. In one database transaction, insert the provider event ID and update the payment. A unique event ID makes duplicate deliveries harmless, and only Pending, Processing, or Unknown payments can be updated so late events cannot overwrite a final status. A distributed lock can reduce duplicate work, but it can expire; database constraints remain the final protection. Typical responses are 201 for a completed new payment, 202 for an Unknown provider outcome, 409 for an in-flight or conflicting payment, 422 for key reuse with different input, and 402 for a declined payment. Return safe ProblemDetails errors.</w:t>
       </w:r>
     </w:p>
     <w:p>
@@ -1305,29 +1217,7 @@
         <w:spacing w:after="85"/>
       </w:pPr>
       <w:r>
-        <w:t xml:space="preserve">Split the requested sort into a property name and optional direction. Look up a public scalar property, then build an </w:t>
-      </w:r>
-      <w:r>
-        <w:rPr>
-          <w:rFonts w:ascii="Consolas" w:hAnsi="Consolas" w:cs="Consolas"/>
-          <w:color w:val="263238"/>
-          <w:shd w:val="clear" w:color="auto" w:fill="EEF2F6"/>
-        </w:rPr>
-        <w:t>OrderBy</w:t>
-      </w:r>
-      <w:r>
-        <w:t xml:space="preserve"> or </w:t>
-      </w:r>
-      <w:r>
-        <w:rPr>
-          <w:rFonts w:ascii="Consolas" w:hAnsi="Consolas" w:cs="Consolas"/>
-          <w:color w:val="263238"/>
-          <w:shd w:val="clear" w:color="auto" w:fill="EEF2F6"/>
-        </w:rPr>
-        <w:t>OrderByDescending</w:t>
-      </w:r>
-      <w:r>
-        <w:t xml:space="preserve"> expression tree. Do not put user text into SQL. Permit only asc and desc; define a default order for empty input.</w:t>
+        <w:t>Split the requested sort into a property name and optional direction. Look up a public scalar property by name without relying on reflection's ambiguous case-insensitive lookup, then build an OrderBy or OrderByDescending expression tree. Do not put user text into SQL. Permit only asc and desc. This helper leaves the query unchanged when no sort is supplied; apply an endpoint default separately if required.</w:t>
       </w:r>
     </w:p>
     <w:p>
@@ -1389,7 +1279,15 @@
         <w:spacing w:after="85"/>
       </w:pPr>
       <w:r>
-        <w:t xml:space="preserve">Generate a correlation ID on the server, put it in the response header and structured log scope, and record elapsed time in </w:t>
+        <w:t>Generate a correlation ID on the server, put it in the response header and structured log scope, and record elapsed time in finally. Log an unhandled exception once with the ID and report status 500 in the timing log even if the response status was not updated, then rethrow it to the central exception handler; do not expose a stack trace to the client.</w:t>
+      </w:r>
+    </w:p>
+    <w:p>
+      <w:pPr>
+        <w:spacing w:after="85"/>
+      </w:pPr>
+      <w:r>
+        <w:t xml:space="preserve">Do not log bodies by default. If a safe endpoint needs request-body logging, enable buffering, read a small bounded prefix, and restore Position in </w:t>
       </w:r>
       <w:r>
         <w:rPr>
@@ -1400,25 +1298,6 @@
         <w:t>finally</w:t>
       </w:r>
       <w:r>
-        <w:t>. Log an unhandled exception once with the ID, then rethrow it to the central exception handler; do not expose a stack trace to the client.</w:t>
-      </w:r>
-    </w:p>
-    <w:p>
-      <w:pPr>
-        <w:spacing w:after="85"/>
-      </w:pPr>
-      <w:r>
-        <w:t xml:space="preserve">Do not log bodies by default. If a safe endpoint needs request-body logging, enable buffering, read a small bounded prefix, and restore Position in </w:t>
-      </w:r>
-      <w:r>
-        <w:rPr>
-          <w:rFonts w:ascii="Consolas" w:hAnsi="Consolas" w:cs="Consolas"/>
-          <w:color w:val="263238"/>
-          <w:shd w:val="clear" w:color="auto" w:fill="EEF2F6"/>
-        </w:rPr>
-        <w:t>finally</w:t>
-      </w:r>
-      <w:r>
         <w:t xml:space="preserve"> so the endpoint can still read the request. For a response, use a bounded pass-through stream that forwards bytes immediately and retains only a small prefix; never buffer a large or streaming response in memory.</w:t>
       </w:r>
     </w:p>
@@ -1427,8 +1306,7 @@
         <w:spacing w:after="85"/>
       </w:pPr>
       <w:r>
-        <w:rPr/>
-        <w:t>Skip files and oversized bodies. Redact secrets and never log authorization/cookie headers, passwords, access tokens, payment credentials, or unnecessary personal data. A regex is not complete protection, so an endpoint allowlist is safer. Treat client cancellation as cancellation, not as a server error.</w:t>
+        <w:t>Skip files and oversized bodies. Redact secrets and never log authorization/cookie headers, passwords, access tokens, payment credentials, or unnecessary personal data. A regex is not complete protection, so an endpoint allowlist is safer. Log client-requested cancellation at Information and report it as 499 in the timing log, not as a server error.</w:t>
       </w:r>
     </w:p>
     <w:p>
@@ -1780,8 +1658,7 @@
         <w:spacing w:after="85"/>
       </w:pPr>
       <w:r>
-        <w:rPr/>
-        <w:t>Build the EF query from active products and add the keyword, price, category, and brand filters only when supplied. EF parameterizes filter values. Allowlist sort fields and directions and reject invalid values. Validate page number, cap page size, limit filter-array sizes, and reject an invalid price range.</w:t>
+        <w:t>Build the EF query from active products and add the keyword, price, category, and brand filters only when supplied. EF parameterizes filter values; escape backslash, % and _ in the keyword so LIKE matches those characters literally. Allowlist sort fields and directions and reject invalid values. Validate page number, cap page size, limit filter-array sizes, and reject an invalid price range.</w:t>
       </w:r>
     </w:p>
     <w:p>

</xml_diff>